<commit_message>
Add Rosemount compliance disclaimers to post captions
Risk warnings added to captions (not graphics) per Romany's preference:
- Pensions risk warning (posts 2, 4, 5, 6, 7, 9, 10)
- Mortgage repossession warning (posts 3, 9)
- Tax treatment disclaimer (posts 2, 6, 7, 10)
- General info disclaimer (posts 1, 3)
- Past performance warning (post 6)
- Source for 72% stat (post 3)
- ISA allowance tax year note (post 7)
- Regulatory statement (post 3)

Post 8 (What Happens In Our Call) already approved — no changes.

Co-Authored-By: Claude Opus 4.6 <noreply@anthropic.com>
</commit_message>
<xml_diff>
--- a/TheFinanceWoman-Instagram-Posts.docx
+++ b/TheFinanceWoman-Instagram-Posts.docx
@@ -259,6 +259,9 @@
         <w:br/>
         <w:br/>
         <w:t>#financialadvice #selfemployed #pensions #financialplanning #selfemployeduk #thefinancewoman</w:t>
+        <w:br/>
+        <w:br/>
+        <w:t>This content is for general informational purposes only and is not personal advice.</w:t>
       </w:r>
     </w:p>
     <w:p/>
@@ -489,6 +492,9 @@
         <w:br/>
         <w:br/>
         <w:t>#pension #selfemployedpension #financialplanning #futureself #selfemployeduk #thefinancewoman</w:t>
+        <w:br/>
+        <w:br/>
+        <w:t>The value of pensions and the income they produce can fall as well as rise. You may get back less than you invested. The benefit to the treatment of tax will depend on your individual circumstances and may be subject to change in future.</w:t>
       </w:r>
     </w:p>
     <w:p>
@@ -708,6 +714,9 @@
         <w:br/>
         <w:br/>
         <w:t>#incomeprotection #selfemployed #freelancer #financialplanning #selfemployeduk #thefinancewoman</w:t>
+        <w:br/>
+        <w:br/>
+        <w:t>Source: Zurich, 2023. Your home may be repossessed if you do not keep up with repayments on your mortgage. This content is for general informational purposes only and is not personal advice. Financial advice should be tailored to your individual circumstances. The Finance Woman is a trading name of NeedingAdvice.co.uk Ltd, an Appointed Representative of Rosemount Financial Solutions (IFA) Ltd, which is authorised and regulated by the Financial Conduct Authority.</w:t>
       </w:r>
     </w:p>
     <w:p>
@@ -924,6 +933,9 @@
         <w:br/>
         <w:br/>
         <w:t>#financialplanning #pension #selfemployed #selfemployedlife #moneygoals #thefinancewoman</w:t>
+        <w:br/>
+        <w:br/>
+        <w:t>The value of pensions and the income they produce can fall as well as rise. You may get back less than you invested.</w:t>
       </w:r>
     </w:p>
     <w:p/>
@@ -1154,6 +1166,9 @@
         <w:br/>
         <w:br/>
         <w:t>#pension #selfemployed #financialadviser #financialplanning #selfemployeduk #thefinancewoman</w:t>
+        <w:br/>
+        <w:br/>
+        <w:t>The value of pensions and the income they produce can fall as well as rise. You may get back less than you invested.</w:t>
       </w:r>
     </w:p>
     <w:p>
@@ -1573,6 +1588,9 @@
         <w:br/>
         <w:br/>
         <w:t>#investing #pensions #myths #selfemployed #financialplanning #thefinancewoman</w:t>
+        <w:br/>
+        <w:br/>
+        <w:t>The value of pensions and investments and the income they produce can fall as well as rise. You may get back less than you invested. The benefits to the treatment of tax will depend on your individual circumstances and may be subject to change in future. Past performance is not indicative of future results.</w:t>
       </w:r>
     </w:p>
     <w:p/>
@@ -1899,6 +1917,9 @@
         <w:br/>
         <w:br/>
         <w:t>#taxseason #selfemployed #pension #ISA #financialplanning #taxplanning #thefinancewoman</w:t>
+        <w:br/>
+        <w:br/>
+        <w:t>The value of pensions and investments and the income they produce can fall as well as rise. You may get back less than you invested. The benefits to the treatment of tax will depend on your individual circumstances and may be subject to change in future. ISA allowance correct as of 2025/26 tax year.</w:t>
       </w:r>
     </w:p>
     <w:p/>
@@ -2561,6 +2582,9 @@
         <w:br/>
         <w:br/>
         <w:t>#financialplanning #thisorthat #pension #mortgage #selfemployed #thefinancewoman</w:t>
+        <w:br/>
+        <w:br/>
+        <w:t>Your home may be repossessed if you do not keep up with repayments on your mortgage. The value of pensions and the income they produce can fall as well as rise. You may get back less than you invested.</w:t>
       </w:r>
     </w:p>
     <w:p/>
@@ -2890,6 +2914,9 @@
         <w:br/>
         <w:br/>
         <w:t>#financialadvice #FAQ #pension #ISA #incomeprotection #selfemployed #thefinancewoman</w:t>
+        <w:br/>
+        <w:br/>
+        <w:t>The value of pensions and investments and the income they produce can fall as well as rise. You may get back less than you invested. The benefits to the treatment of tax will depend on your individual circumstances and may be subject to change in future.</w:t>
       </w:r>
     </w:p>
     <w:p/>

</xml_diff>